<commit_message>
Alterações Feitas no Conteudo Principal
</commit_message>
<xml_diff>
--- a/primeirapt/Sistema de Recuperacao de Documentos Perdidos.docx
+++ b/primeirapt/Sistema de Recuperacao de Documentos Perdidos.docx
@@ -264,7 +264,10 @@
         <w:spacing w:after="160"/>
       </w:pPr>
       <w:r>
-        <w:t>Nome do Aluno: Casimiro Luzolo Gaspar Puaia</w:t>
+        <w:t>Nome do Aluno: Casimiro Luzolo Gaspar</w:t>
+      </w:r>
+      <w:r>
+        <w:t xml:space="preserve"> Puaia</w:t>
       </w:r>
     </w:p>
     <w:p>
@@ -1547,13 +1550,7 @@
         <w:jc w:val="both"/>
       </w:pPr>
       <w:r>
-        <w:t>D</w:t>
-      </w:r>
-      <w:r>
-        <w:t>esenvolver e avaliar um sistema web de recuperação de documentos perdidos, baseado em OCR e em recuperação de informação híbrida (lexical e semântica)</w:t>
-      </w:r>
-      <w:r>
-        <w:t>.</w:t>
+        <w:t>Desenvolver e avaliar um sistema web de recuperação de documentos perdidos, baseado em OCR e em recuperação de informação híbrida (lexical e semântica).</w:t>
       </w:r>
     </w:p>
     <w:p>
@@ -1765,12 +1762,6 @@
         <w:gridCol w:w="1888"/>
       </w:tblGrid>
       <w:tr>
-        <w:tblPrEx>
-          <w:tblCellMar>
-            <w:top w:w="0" w:type="dxa"/>
-            <w:bottom w:w="0" w:type="dxa"/>
-          </w:tblCellMar>
-        </w:tblPrEx>
         <w:trPr>
           <w:cantSplit/>
           <w:tblHeader/>
@@ -1922,12 +1913,6 @@
         </w:tc>
       </w:tr>
       <w:tr>
-        <w:tblPrEx>
-          <w:tblCellMar>
-            <w:top w:w="0" w:type="dxa"/>
-            <w:bottom w:w="0" w:type="dxa"/>
-          </w:tblCellMar>
-        </w:tblPrEx>
         <w:trPr>
           <w:cantSplit/>
         </w:trPr>
@@ -2016,12 +2001,6 @@
         </w:tc>
       </w:tr>
       <w:tr>
-        <w:tblPrEx>
-          <w:tblCellMar>
-            <w:top w:w="0" w:type="dxa"/>
-            <w:bottom w:w="0" w:type="dxa"/>
-          </w:tblCellMar>
-        </w:tblPrEx>
         <w:trPr>
           <w:cantSplit/>
         </w:trPr>
@@ -2157,12 +2136,6 @@
         </w:tc>
       </w:tr>
       <w:tr>
-        <w:tblPrEx>
-          <w:tblCellMar>
-            <w:top w:w="0" w:type="dxa"/>
-            <w:bottom w:w="0" w:type="dxa"/>
-          </w:tblCellMar>
-        </w:tblPrEx>
         <w:trPr>
           <w:cantSplit/>
         </w:trPr>
@@ -2225,12 +2198,6 @@
         </w:tc>
       </w:tr>
       <w:tr>
-        <w:tblPrEx>
-          <w:tblCellMar>
-            <w:top w:w="0" w:type="dxa"/>
-            <w:bottom w:w="0" w:type="dxa"/>
-          </w:tblCellMar>
-        </w:tblPrEx>
         <w:trPr>
           <w:cantSplit/>
         </w:trPr>
@@ -2367,12 +2334,6 @@
         </w:tc>
       </w:tr>
       <w:tr>
-        <w:tblPrEx>
-          <w:tblCellMar>
-            <w:top w:w="0" w:type="dxa"/>
-            <w:bottom w:w="0" w:type="dxa"/>
-          </w:tblCellMar>
-        </w:tblPrEx>
         <w:trPr>
           <w:cantSplit/>
         </w:trPr>
@@ -2508,12 +2469,6 @@
         </w:tc>
       </w:tr>
       <w:tr>
-        <w:tblPrEx>
-          <w:tblCellMar>
-            <w:top w:w="0" w:type="dxa"/>
-            <w:bottom w:w="0" w:type="dxa"/>
-          </w:tblCellMar>
-        </w:tblPrEx>
         <w:trPr>
           <w:cantSplit/>
         </w:trPr>
@@ -2602,12 +2557,6 @@
         </w:tc>
       </w:tr>
       <w:tr>
-        <w:tblPrEx>
-          <w:tblCellMar>
-            <w:top w:w="0" w:type="dxa"/>
-            <w:bottom w:w="0" w:type="dxa"/>
-          </w:tblCellMar>
-        </w:tblPrEx>
         <w:trPr>
           <w:cantSplit/>
         </w:trPr>
@@ -2696,12 +2645,6 @@
         </w:tc>
       </w:tr>
       <w:tr>
-        <w:tblPrEx>
-          <w:tblCellMar>
-            <w:top w:w="0" w:type="dxa"/>
-            <w:bottom w:w="0" w:type="dxa"/>
-          </w:tblCellMar>
-        </w:tblPrEx>
         <w:trPr>
           <w:cantSplit/>
         </w:trPr>
@@ -2970,12 +2913,6 @@
         <w:gridCol w:w="4111"/>
       </w:tblGrid>
       <w:tr>
-        <w:tblPrEx>
-          <w:tblCellMar>
-            <w:top w:w="0" w:type="dxa"/>
-            <w:bottom w:w="0" w:type="dxa"/>
-          </w:tblCellMar>
-        </w:tblPrEx>
         <w:trPr>
           <w:cantSplit/>
           <w:tblHeader/>
@@ -3069,12 +3006,6 @@
         </w:tc>
       </w:tr>
       <w:tr>
-        <w:tblPrEx>
-          <w:tblCellMar>
-            <w:top w:w="0" w:type="dxa"/>
-            <w:bottom w:w="0" w:type="dxa"/>
-          </w:tblCellMar>
-        </w:tblPrEx>
         <w:trPr>
           <w:cantSplit/>
         </w:trPr>
@@ -3158,12 +3089,6 @@
         </w:tc>
       </w:tr>
       <w:tr>
-        <w:tblPrEx>
-          <w:tblCellMar>
-            <w:top w:w="0" w:type="dxa"/>
-            <w:bottom w:w="0" w:type="dxa"/>
-          </w:tblCellMar>
-        </w:tblPrEx>
         <w:trPr>
           <w:cantSplit/>
         </w:trPr>
@@ -3247,12 +3172,6 @@
         </w:tc>
       </w:tr>
       <w:tr>
-        <w:tblPrEx>
-          <w:tblCellMar>
-            <w:top w:w="0" w:type="dxa"/>
-            <w:bottom w:w="0" w:type="dxa"/>
-          </w:tblCellMar>
-        </w:tblPrEx>
         <w:trPr>
           <w:cantSplit/>
         </w:trPr>
@@ -3336,12 +3255,6 @@
         </w:tc>
       </w:tr>
       <w:tr>
-        <w:tblPrEx>
-          <w:tblCellMar>
-            <w:top w:w="0" w:type="dxa"/>
-            <w:bottom w:w="0" w:type="dxa"/>
-          </w:tblCellMar>
-        </w:tblPrEx>
         <w:trPr>
           <w:cantSplit/>
         </w:trPr>
@@ -3425,12 +3338,6 @@
         </w:tc>
       </w:tr>
       <w:tr>
-        <w:tblPrEx>
-          <w:tblCellMar>
-            <w:top w:w="0" w:type="dxa"/>
-            <w:bottom w:w="0" w:type="dxa"/>
-          </w:tblCellMar>
-        </w:tblPrEx>
         <w:trPr>
           <w:cantSplit/>
         </w:trPr>
@@ -3514,12 +3421,6 @@
         </w:tc>
       </w:tr>
       <w:tr>
-        <w:tblPrEx>
-          <w:tblCellMar>
-            <w:top w:w="0" w:type="dxa"/>
-            <w:bottom w:w="0" w:type="dxa"/>
-          </w:tblCellMar>
-        </w:tblPrEx>
         <w:trPr>
           <w:cantSplit/>
         </w:trPr>
@@ -3603,12 +3504,6 @@
         </w:tc>
       </w:tr>
       <w:tr>
-        <w:tblPrEx>
-          <w:tblCellMar>
-            <w:top w:w="0" w:type="dxa"/>
-            <w:bottom w:w="0" w:type="dxa"/>
-          </w:tblCellMar>
-        </w:tblPrEx>
         <w:trPr>
           <w:cantSplit/>
         </w:trPr>
@@ -3896,12 +3791,6 @@
         <w:gridCol w:w="3394"/>
       </w:tblGrid>
       <w:tr>
-        <w:tblPrEx>
-          <w:tblCellMar>
-            <w:top w:w="0" w:type="dxa"/>
-            <w:bottom w:w="0" w:type="dxa"/>
-          </w:tblCellMar>
-        </w:tblPrEx>
         <w:trPr>
           <w:cantSplit/>
           <w:tblHeader/>
@@ -3995,12 +3884,6 @@
         </w:tc>
       </w:tr>
       <w:tr>
-        <w:tblPrEx>
-          <w:tblCellMar>
-            <w:top w:w="0" w:type="dxa"/>
-            <w:bottom w:w="0" w:type="dxa"/>
-          </w:tblCellMar>
-        </w:tblPrEx>
         <w:trPr>
           <w:cantSplit/>
         </w:trPr>
@@ -4084,12 +3967,6 @@
         </w:tc>
       </w:tr>
       <w:tr>
-        <w:tblPrEx>
-          <w:tblCellMar>
-            <w:top w:w="0" w:type="dxa"/>
-            <w:bottom w:w="0" w:type="dxa"/>
-          </w:tblCellMar>
-        </w:tblPrEx>
         <w:trPr>
           <w:cantSplit/>
         </w:trPr>
@@ -4173,12 +4050,6 @@
         </w:tc>
       </w:tr>
       <w:tr>
-        <w:tblPrEx>
-          <w:tblCellMar>
-            <w:top w:w="0" w:type="dxa"/>
-            <w:bottom w:w="0" w:type="dxa"/>
-          </w:tblCellMar>
-        </w:tblPrEx>
         <w:trPr>
           <w:cantSplit/>
         </w:trPr>
@@ -4262,12 +4133,6 @@
         </w:tc>
       </w:tr>
       <w:tr>
-        <w:tblPrEx>
-          <w:tblCellMar>
-            <w:top w:w="0" w:type="dxa"/>
-            <w:bottom w:w="0" w:type="dxa"/>
-          </w:tblCellMar>
-        </w:tblPrEx>
         <w:trPr>
           <w:cantSplit/>
         </w:trPr>
@@ -4351,12 +4216,6 @@
         </w:tc>
       </w:tr>
       <w:tr>
-        <w:tblPrEx>
-          <w:tblCellMar>
-            <w:top w:w="0" w:type="dxa"/>
-            <w:bottom w:w="0" w:type="dxa"/>
-          </w:tblCellMar>
-        </w:tblPrEx>
         <w:trPr>
           <w:cantSplit/>
         </w:trPr>
@@ -4440,12 +4299,6 @@
         </w:tc>
       </w:tr>
       <w:tr>
-        <w:tblPrEx>
-          <w:tblCellMar>
-            <w:top w:w="0" w:type="dxa"/>
-            <w:bottom w:w="0" w:type="dxa"/>
-          </w:tblCellMar>
-        </w:tblPrEx>
         <w:trPr>
           <w:cantSplit/>
         </w:trPr>
@@ -4529,12 +4382,6 @@
         </w:tc>
       </w:tr>
       <w:tr>
-        <w:tblPrEx>
-          <w:tblCellMar>
-            <w:top w:w="0" w:type="dxa"/>
-            <w:bottom w:w="0" w:type="dxa"/>
-          </w:tblCellMar>
-        </w:tblPrEx>
         <w:trPr>
           <w:cantSplit/>
         </w:trPr>
@@ -4776,12 +4623,6 @@
         <w:gridCol w:w="3394"/>
       </w:tblGrid>
       <w:tr>
-        <w:tblPrEx>
-          <w:tblCellMar>
-            <w:top w:w="0" w:type="dxa"/>
-            <w:bottom w:w="0" w:type="dxa"/>
-          </w:tblCellMar>
-        </w:tblPrEx>
         <w:trPr>
           <w:cantSplit/>
           <w:tblHeader/>
@@ -4875,12 +4716,6 @@
         </w:tc>
       </w:tr>
       <w:tr>
-        <w:tblPrEx>
-          <w:tblCellMar>
-            <w:top w:w="0" w:type="dxa"/>
-            <w:bottom w:w="0" w:type="dxa"/>
-          </w:tblCellMar>
-        </w:tblPrEx>
         <w:trPr>
           <w:cantSplit/>
         </w:trPr>
@@ -4964,12 +4799,6 @@
         </w:tc>
       </w:tr>
       <w:tr>
-        <w:tblPrEx>
-          <w:tblCellMar>
-            <w:top w:w="0" w:type="dxa"/>
-            <w:bottom w:w="0" w:type="dxa"/>
-          </w:tblCellMar>
-        </w:tblPrEx>
         <w:trPr>
           <w:cantSplit/>
         </w:trPr>
@@ -5053,12 +4882,6 @@
         </w:tc>
       </w:tr>
       <w:tr>
-        <w:tblPrEx>
-          <w:tblCellMar>
-            <w:top w:w="0" w:type="dxa"/>
-            <w:bottom w:w="0" w:type="dxa"/>
-          </w:tblCellMar>
-        </w:tblPrEx>
         <w:trPr>
           <w:cantSplit/>
         </w:trPr>
@@ -5142,12 +4965,6 @@
         </w:tc>
       </w:tr>
       <w:tr>
-        <w:tblPrEx>
-          <w:tblCellMar>
-            <w:top w:w="0" w:type="dxa"/>
-            <w:bottom w:w="0" w:type="dxa"/>
-          </w:tblCellMar>
-        </w:tblPrEx>
         <w:trPr>
           <w:cantSplit/>
         </w:trPr>
@@ -5231,12 +5048,6 @@
         </w:tc>
       </w:tr>
       <w:tr>
-        <w:tblPrEx>
-          <w:tblCellMar>
-            <w:top w:w="0" w:type="dxa"/>
-            <w:bottom w:w="0" w:type="dxa"/>
-          </w:tblCellMar>
-        </w:tblPrEx>
         <w:trPr>
           <w:cantSplit/>
         </w:trPr>
@@ -5320,12 +5131,6 @@
         </w:tc>
       </w:tr>
       <w:tr>
-        <w:tblPrEx>
-          <w:tblCellMar>
-            <w:top w:w="0" w:type="dxa"/>
-            <w:bottom w:w="0" w:type="dxa"/>
-          </w:tblCellMar>
-        </w:tblPrEx>
         <w:trPr>
           <w:cantSplit/>
         </w:trPr>
@@ -5409,12 +5214,6 @@
         </w:tc>
       </w:tr>
       <w:tr>
-        <w:tblPrEx>
-          <w:tblCellMar>
-            <w:top w:w="0" w:type="dxa"/>
-            <w:bottom w:w="0" w:type="dxa"/>
-          </w:tblCellMar>
-        </w:tblPrEx>
         <w:trPr>
           <w:cantSplit/>
         </w:trPr>
@@ -6467,12 +6266,6 @@
         <w:gridCol w:w="3488"/>
       </w:tblGrid>
       <w:tr>
-        <w:tblPrEx>
-          <w:tblCellMar>
-            <w:top w:w="0" w:type="dxa"/>
-            <w:bottom w:w="0" w:type="dxa"/>
-          </w:tblCellMar>
-        </w:tblPrEx>
         <w:trPr>
           <w:cantSplit/>
           <w:tblHeader/>
@@ -6566,12 +6359,6 @@
         </w:tc>
       </w:tr>
       <w:tr>
-        <w:tblPrEx>
-          <w:tblCellMar>
-            <w:top w:w="0" w:type="dxa"/>
-            <w:bottom w:w="0" w:type="dxa"/>
-          </w:tblCellMar>
-        </w:tblPrEx>
         <w:trPr>
           <w:cantSplit/>
         </w:trPr>
@@ -6655,12 +6442,6 @@
         </w:tc>
       </w:tr>
       <w:tr>
-        <w:tblPrEx>
-          <w:tblCellMar>
-            <w:top w:w="0" w:type="dxa"/>
-            <w:bottom w:w="0" w:type="dxa"/>
-          </w:tblCellMar>
-        </w:tblPrEx>
         <w:trPr>
           <w:cantSplit/>
         </w:trPr>
@@ -6744,12 +6525,6 @@
         </w:tc>
       </w:tr>
       <w:tr>
-        <w:tblPrEx>
-          <w:tblCellMar>
-            <w:top w:w="0" w:type="dxa"/>
-            <w:bottom w:w="0" w:type="dxa"/>
-          </w:tblCellMar>
-        </w:tblPrEx>
         <w:trPr>
           <w:cantSplit/>
         </w:trPr>
@@ -6833,12 +6608,6 @@
         </w:tc>
       </w:tr>
       <w:tr>
-        <w:tblPrEx>
-          <w:tblCellMar>
-            <w:top w:w="0" w:type="dxa"/>
-            <w:bottom w:w="0" w:type="dxa"/>
-          </w:tblCellMar>
-        </w:tblPrEx>
         <w:trPr>
           <w:cantSplit/>
         </w:trPr>
@@ -6922,12 +6691,6 @@
         </w:tc>
       </w:tr>
       <w:tr>
-        <w:tblPrEx>
-          <w:tblCellMar>
-            <w:top w:w="0" w:type="dxa"/>
-            <w:bottom w:w="0" w:type="dxa"/>
-          </w:tblCellMar>
-        </w:tblPrEx>
         <w:trPr>
           <w:cantSplit/>
         </w:trPr>
@@ -7011,12 +6774,6 @@
         </w:tc>
       </w:tr>
       <w:tr>
-        <w:tblPrEx>
-          <w:tblCellMar>
-            <w:top w:w="0" w:type="dxa"/>
-            <w:bottom w:w="0" w:type="dxa"/>
-          </w:tblCellMar>
-        </w:tblPrEx>
         <w:trPr>
           <w:cantSplit/>
         </w:trPr>
@@ -7100,12 +6857,6 @@
         </w:tc>
       </w:tr>
       <w:tr>
-        <w:tblPrEx>
-          <w:tblCellMar>
-            <w:top w:w="0" w:type="dxa"/>
-            <w:bottom w:w="0" w:type="dxa"/>
-          </w:tblCellMar>
-        </w:tblPrEx>
         <w:trPr>
           <w:cantSplit/>
         </w:trPr>
@@ -8905,6 +8656,7 @@
   <w:style w:type="character" w:default="1" w:styleId="Fontepargpadro">
     <w:name w:val="Default Paragraph Font"/>
     <w:uiPriority w:val="1"/>
+    <w:semiHidden/>
     <w:unhideWhenUsed/>
   </w:style>
   <w:style w:type="table" w:default="1" w:styleId="Tabelanormal">

</xml_diff>